<commit_message>
Update Project Y documentation through 21 October 2026
</commit_message>
<xml_diff>
--- a/app/static/documents/Project_Y_Architecture_and_Operations_Documentation_V1.docx
+++ b/app/static/documents/Project_Y_Architecture_and_Operations_Documentation_V1.docx
@@ -25,8 +25,7 @@
         <w:pStyle w:val="Normal"/>
       </w:pPr>
       <w:r>
-        <w:rPr/>
-        <w:t xml:space="preserve">Documentation V1</w:t>
+        <w:t>Documentation V1 Updated 21 October 2026</w:t>
       </w:r>
     </w:p>
     <w:p>
@@ -34,12 +33,11 @@
         <w:pStyle w:val="Normal"/>
       </w:pPr>
       <w:r>
-        <w:rPr/>
-        <w:t xml:space="preserve">Author: Daniel Dahan</w:t>
+        <w:t>Author: Daniel Dahan</w:t>
         <w:br/>
-        <w:t xml:space="preserve">Updated: 5 October 2026</w:t>
+        <w:t>Updated: 21 October 2026</w:t>
         <w:br/>
-        <w:t xml:space="preserve">Status: Application deployed and build archives operational</w:t>
+        <w:t>Status: Ticket submission verified live and My Tickets deployed</w:t>
       </w:r>
     </w:p>
     <w:p>
@@ -67,8 +65,7 @@
         <w:pStyle w:val="Normal"/>
       </w:pPr>
       <w:r>
-        <w:rPr/>
-        <w:t xml:space="preserve">The current deployment uses PostgreSQL on the NAS. Every completed pipeline attempts to archive its build output to the NAS; Build 30 verified the first complete Docker image archive after the image-marker correction. Existing authenticated SMB users can browse the application archives.</w:t>
+        <w:t>The deployment uses PostgreSQL 17 on the NAS. Jenkins archives completed build outputs with checksums for existing SMB users. Ticket submission was verified on the live site on 21 October 2026; My Tickets was subsequently implemented and merged through PR 10.</w:t>
       </w:r>
     </w:p>
     <w:p>
@@ -134,16 +131,15 @@
         <w:pStyle w:val="Normal"/>
       </w:pPr>
       <w:r>
-        <w:rPr/>
-        <w:t xml:space="preserve">Latest verified pipeline: Build 30.</w:t>
+        <w:t>Latest verified pipeline: Build 37, SUCCESS.</w:t>
         <w:br/>
-        <w:t xml:space="preserve">Deployed revision: 1da1bce9b92d886581d566d059124fecb5783ab6.</w:t>
+        <w:t>Revision: 742517dae0bc from the merged My Tickets release.</w:t>
         <w:br/>
-        <w:t xml:space="preserve">Docker tag: project-y:build-30-1da1bce9b92d.</w:t>
+        <w:t>Image: project-y:build-37-742517dae0bc.</w:t>
         <w:br/>
-        <w:t xml:space="preserve">Pipeline result: SUCCESS.</w:t>
+        <w:t>My Tickets: PR 10 merged to main as 742517d.</w:t>
         <w:br/>
-        <w:t xml:space="preserve">NAS image checksum verification: passed.</w:t>
+        <w:t>Latest local regression run: 65 tests passed, no skips.</w:t>
       </w:r>
     </w:p>
     <w:p>
@@ -358,8 +354,7 @@
         <w:pStyle w:val="ListBullet"/>
       </w:pPr>
       <w:r>
-        <w:rPr/>
-        <w:t xml:space="preserve">app/routes/ contains home, authentication, dashboard, architecture and server routes.</w:t>
+        <w:t>app/routes/ contains home, authentication, dashboard, architecture, server, profile and ticket Blueprints. app/models/ticket.py maps the existing PostgreSQL tickets table.</w:t>
       </w:r>
     </w:p>
     <w:p>
@@ -405,8 +400,7 @@
         <w:pStyle w:val="Normal"/>
       </w:pPr>
       <w:r>
-        <w:rPr/>
-        <w:t xml:space="preserve">The users table contains id, username, email, password_hash and created_at. Username and email have unique constraints. Passwords are hashed using Werkzeug; login checks the hash rather than storing or comparing plaintext passwords. Flask-Login manages sessions and protects the dashboard with login_required.</w:t>
+        <w:t>The users table stores id, username, email, password_hash and created_at, plus email_verification_required, email_verified, verification_last_sent_at and profile_image_key. Werkzeug hashes passwords and checks them at login. Flask-Login protects authenticated pages and rejects pending accounts that require email verification.</w:t>
       </w:r>
     </w:p>
     <w:p>
@@ -439,8 +433,7 @@
         <w:pStyle w:val="Normal"/>
       </w:pPr>
       <w:r>
-        <w:rPr/>
-        <w:t xml:space="preserve">Registration currently checks the exact submitted username. Its duplicate check and database uniqueness are not normalized to lower case. Case-variant accounts therefore remain a follow-up consideration; the login change does not establish case-insensitive registration uniqueness.</w:t>
+        <w:t>Registration checks usernames and email addresses case-insensitively. PostgreSQL also enforces users_username_lower_unique on lower(username), preventing case-variant username collisions. Profile name changes retain the stable user ID and ticket ownership.</w:t>
       </w:r>
     </w:p>
     <w:p>
@@ -518,8 +511,7 @@
         <w:pStyle w:val="Normal"/>
       </w:pPr>
       <w:r>
-        <w:rPr/>
-        <w:t xml:space="preserve">The Compose file and application configuration still contain development defaults. The active pipeline does not inject SECRET_KEY, so the application default dev-secret-key remains a hardening task. Database backup and restore are separate from the Docker image archives described here.</w:t>
+        <w:t>The active Jenkins pipeline injects SECRET_KEY through project-y-secret-key and requires at least 32 characters for that application signing secret. It also injects the Brevo API key and enables secure session cookies. Development defaults in local configuration are separate from production settings. Database backups remain separate from Docker image archives.</w:t>
       </w:r>
     </w:p>
     <w:p>
@@ -637,8 +629,7 @@
         <w:pStyle w:val="Normal"/>
       </w:pPr>
       <w:r>
-        <w:rPr/>
-        <w:t xml:space="preserve">PR 1 added the weather and clock footer. PR 2 introduced NAS build archives. PR 3 corrected the image marker so successful builds include the Docker image. A GitHub push triggered the verified Jenkins builds.</w:t>
+        <w:t>PRs 1 to 3 established the footer and verified NAS image archives. PR 4 added email verification; PR 5 published the document library; PR 7 added profile image and username changes. PR 8 introduced the ticket form, PR 9 enabled persistence, and PR 10 added My Tickets and private ticket details.</w:t>
       </w:r>
     </w:p>
     <w:p>
@@ -675,8 +666,7 @@
         <w:pStyle w:val="ListBullet"/>
       </w:pPr>
       <w:r>
-        <w:rPr/>
-        <w:t xml:space="preserve">Validate Flask: runs python -m py_compile run.py. This is a syntax check, not a full Flask integration test.</w:t>
+        <w:t>Validate Flask: runs py_compile and the unittest suite. Build 36 ran 55 tests, with 52 passing and three PostgreSQL integration tests skipped because TEST_POSTGRES_URI was not configured.</w:t>
       </w:r>
     </w:p>
     <w:p>
@@ -693,8 +683,7 @@
         <w:pStyle w:val="ListBullet"/>
       </w:pPr>
       <w:r>
-        <w:rPr/>
-        <w:t xml:space="preserve">Deploy: stops and removes the previous project-y container, then starts the exact newly built version with database environment variables.</w:t>
+        <w:t>Deploy: runs repeatable email and profile schema migrations before stopping the existing container, then starts the exact newly built image with database, Brevo, session and S3 settings. The tickets table was created manually in the NAS database; no ticket migration command is currently in this pipeline.</w:t>
       </w:r>
     </w:p>
     <w:p>
@@ -1301,8 +1290,7 @@
         <w:pStyle w:val="ListBullet"/>
       </w:pPr>
       <w:r>
-        <w:rPr/>
-        <w:t xml:space="preserve">Create and verify a dedicated PostgreSQL backup and restore process.</w:t>
+        <w:t>Repeat PostgreSQL restore rehearsals and automate scheduled database backups with retention. A complete restore test on 7 October returned three users; the fresh 21 October pre-ticket backup passed checksum and archive-list checks.</w:t>
       </w:r>
     </w:p>
     <w:p>
@@ -1319,8 +1307,7 @@
         <w:pStyle w:val="ListBullet"/>
       </w:pPr>
       <w:r>
-        <w:rPr/>
-        <w:t xml:space="preserve">Run application integration tests in Jenkins; the current Flask validation is py_compile only.</w:t>
+        <w:t>Configure disposable PostgreSQL integration testing in Jenkins. The full unittest suite already runs there, but three database migration tests are skipped without TEST_POSTGRES_URI.</w:t>
       </w:r>
     </w:p>
     <w:p>
@@ -1337,8 +1324,7 @@
         <w:pStyle w:val="ListBullet"/>
       </w:pPr>
       <w:r>
-        <w:rPr/>
-        <w:t xml:space="preserve">Configure SECRET_KEY through credentials, review development defaults and make registration uniqueness consistent with login case handling.</w:t>
+        <w:t>Keep production secrets in Jenkins credentials and review local development defaults. SECRET_KEY injection and case-insensitive username uniqueness are implemented.</w:t>
       </w:r>
     </w:p>
     <w:p>
@@ -1375,8 +1361,7 @@
         <w:pStyle w:val="Normal"/>
       </w:pPr>
       <w:r>
-        <w:rPr/>
-        <w:t xml:space="preserve">Project X and Project Y Architecture Documentation V5, updated 10 August 2026, provides the infrastructure baseline. Project Y source, Jenkins Console Output for Builds 29 and 30, and the backup and service outputs supplied on 5 October 2026 provide the current application and operational checkpoint.</w:t>
+        <w:t>Project X and Project Y Architecture Documentation V5 supplies the infrastructure baseline. The 5 October recovery outputs remain historical evidence. The 21 October ticket schema, Build 36 log, live ticket query, merged PRs 9 and 10, and local 65-test run establish the updated application checkpoint.</w:t>
       </w:r>
     </w:p>
     <w:p>
@@ -1401,6 +1386,335 @@
       <w:r>
         <w:rPr/>
         <w:t xml:space="preserve">The design reuses existing EC2, VPC, EBS and NAS resources. No snapshot or machine image was created in this backup phase. Storage and infrastructure costs remain subject to actual AWS resource usage.</w:t>
+      </w:r>
+    </w:p>
+    <w:p>
+      <w:pPr>
+        <w:pStyle w:val="Heading1"/>
+        <w:pageBreakBefore/>
+      </w:pPr>
+      <w:r>
+        <w:t>Email Verification and Profile Storage</w:t>
+      </w:r>
+    </w:p>
+    <w:p>
+      <w:pPr>
+        <w:pStyle w:val="Heading2"/>
+      </w:pPr>
+      <w:r>
+        <w:t>Email verification through Brevo</w:t>
+      </w:r>
+    </w:p>
+    <w:p>
+      <w:r>
+        <w:t>The sender noreply@project-x.ink is authenticated through Brevo and domain DNS records. Jenkins supplies project-y-brevo-api-key as Secret text; its value is never committed to Git or included in this document. New registrations remain pending until the user confirms their email.</w:t>
+      </w:r>
+    </w:p>
+    <w:p>
+      <w:r>
+        <w:t>The application creates a signed, expiring verification token. A GET opens the confirmation page and a CSRF-protected POST verifies the account, avoiding confirmation by automatic mail-link scanners. Tokens expire after one hour. Resending requires the account password and a database-enforced cooldown. Legacy accounts retain the migration policy that was explicitly established for them.</w:t>
+      </w:r>
+    </w:p>
+    <w:p>
+      <w:pPr>
+        <w:pStyle w:val="Heading2"/>
+      </w:pPr>
+      <w:r>
+        <w:t>Profile pictures in private S3 storage</w:t>
+      </w:r>
+    </w:p>
+    <w:p>
+      <w:r>
+        <w:t>Authenticated users can change their username, upload a profile image and remove it. The bucket is project-y-profile-images-daniel-081809265825 in us-east-1. Public access is blocked. The EC2 role ProjectY-EC2-ReadOnly supplies temporary AWS credentials to boto3; the role has a separate policy allowing profile object operations under avatars/. No long-lived AWS key is stored in application code.</w:t>
+      </w:r>
+    </w:p>
+    <w:p>
+      <w:r>
+        <w:t>PostgreSQL stores only profile_image_key, for example avatars/&lt;user_id&gt;/&lt;random_id&gt;.jpg. The application generates a signed GET URL valid for 15 minutes. Authenticated HTML responses use private, no-store cache control. Username changes preserve the numeric ID used by images and tickets.</w:t>
+      </w:r>
+    </w:p>
+    <w:p>
+      <w:r>
+        <w:t>Uploads accept JPEG or PNG, up to 2 MiB and 16 million pixels. Pillow validates and normalizes the image, removes metadata and resizes it to fit 512 by 512 pixels. New objects use randomized keys and S3 encryption. The database commit precedes deletion of an old image; a failed database write triggers cleanup of the new object. Cleanup failures can leave an unused object for later maintenance.</w:t>
+      </w:r>
+    </w:p>
+    <w:p>
+      <w:pPr>
+        <w:pStyle w:val="Heading2"/>
+      </w:pPr>
+      <w:r>
+        <w:t>Database recovery baseline</w:t>
+      </w:r>
+    </w:p>
+    <w:p>
+      <w:r>
+        <w:t>Before ticket-table creation, a new custom-format PostgreSQL dump was created at /data/backups/project-y-db/20261021T121618Z. project_y.dump and restore-list.txt passed SHA256 verification. The archive list was readable. This particular backup was not restored in the 21 October session; the earlier 7 October rehearsal completed a restore and counted three users.</w:t>
+      </w:r>
+    </w:p>
+    <w:p>
+      <w:pPr>
+        <w:pStyle w:val="Heading1"/>
+        <w:pageBreakBefore/>
+      </w:pPr>
+      <w:r>
+        <w:t>Ticket Submission and PostgreSQL Schema</w:t>
+      </w:r>
+    </w:p>
+    <w:p>
+      <w:pPr>
+        <w:pStyle w:val="Heading2"/>
+      </w:pPr>
+      <w:r>
+        <w:t>Work completed on 21 October 2026</w:t>
+      </w:r>
+    </w:p>
+    <w:p>
+      <w:r>
+        <w:t>The PESH navigation item was replaced with Open a Ticket and moved beside the signed-in profile controls. Anonymous visitors do not see it, and direct access requires login. The initial form was deliberately disabled until persistence was ready. Subject, description and low, normal or high priority are now submitted to Flask by POST.</w:t>
+      </w:r>
+    </w:p>
+    <w:p>
+      <w:r>
+        <w:t>GET /tickets/new renders the form. POST validates the session CSRF token, trims subject and description, checks allowed values and creates Ticket with current_user.id. Submitted owner or status fields are ignored. New tickets start as open. A successful commit displays the ticket number and redirects; database errors roll back and return a retry message. Validation errors retain the entered text.</w:t>
+      </w:r>
+    </w:p>
+    <w:p>
+      <w:pPr>
+        <w:pStyle w:val="Heading2"/>
+      </w:pPr>
+      <w:r>
+        <w:t>Tickets table</w:t>
+      </w:r>
+    </w:p>
+    <w:p>
+      <w:pPr>
+        <w:spacing w:after="140"/>
+      </w:pPr>
+      <w:r>
+        <w:rPr>
+          <w:rFonts w:ascii="Consolas" w:hAnsi="Consolas"/>
+          <w:sz w:val="18"/>
+        </w:rPr>
+        <w:t>id           INTEGER GENERATED ALWAYS AS IDENTITY PRIMARY KEY</w:t>
+        <w:br/>
+        <w:t>user_id      INTEGER NOT NULL REFERENCES users(id)</w:t>
+        <w:br/>
+        <w:t xml:space="preserve">             ON DELETE RESTRICT</w:t>
+        <w:br/>
+        <w:t>subject      VARCHAR(160) NOT NULL</w:t>
+        <w:br/>
+        <w:t>description  TEXT NOT NULL</w:t>
+        <w:br/>
+        <w:t>priority     VARCHAR(10) NOT NULL DEFAULT normal</w:t>
+        <w:br/>
+        <w:t>status       VARCHAR(20) NOT NULL DEFAULT open</w:t>
+        <w:br/>
+        <w:t>created_at   TIMESTAMPTZ NOT NULL DEFAULT CURRENT_TIMESTAMP</w:t>
+      </w:r>
+    </w:p>
+    <w:p>
+      <w:r>
+        <w:t>The SQL definition enforces nonblank subjects, descriptions of 1 to 5000 characters, priorities low, normal or high, and statuses open, in_progress or resolved. The index tickets_user_created_idx covers user_id and created_at DESC. The table was created in a transaction with a five-second lock timeout. The ORM maps the existing table; it does not replace it. ON DELETE RESTRICT prevents removing a user while tickets still reference that account.</w:t>
+      </w:r>
+    </w:p>
+    <w:p>
+      <w:pPr>
+        <w:pStyle w:val="Heading2"/>
+      </w:pPr>
+      <w:r>
+        <w:t>Live validation</w:t>
+      </w:r>
+    </w:p>
+    <w:p>
+      <w:r>
+        <w:t>PR 9 merged feature/ticket-submission after commit 6fa25f4. Jenkins Build 36 deployed image project-y:build-36-39a28820b5f0 and finished SUCCESS. Its image and metadata archive passed remote checksums at /data/share/project-y-builds/Project_Y-f9e324b8/build-36-39a28820b5f0.</w:t>
+      </w:r>
+    </w:p>
+    <w:p>
+      <w:r>
+        <w:t>Daniel submitted First live ticket through the live website. A read-only PostgreSQL query confirmed ticket ID 1, user Daniel, priority high, status open and creation time 2026-10-21 13:30:02.009231 UTC. This verifies the browser to Flask to PostgreSQL path, beyond the isolated unit tests.</w:t>
+      </w:r>
+    </w:p>
+    <w:p>
+      <w:pPr>
+        <w:pStyle w:val="Heading1"/>
+        <w:pageBreakBefore/>
+      </w:pPr>
+      <w:r>
+        <w:t>My Tickets and Access Control</w:t>
+      </w:r>
+    </w:p>
+    <w:p>
+      <w:pPr>
+        <w:pStyle w:val="Heading2"/>
+      </w:pPr>
+      <w:r>
+        <w:t>Personal list and ticket details</w:t>
+      </w:r>
+    </w:p>
+    <w:p>
+      <w:r>
+        <w:t>PR 10 implements GET /tickets and GET /tickets/&lt;ticket_id&gt;. The My Tickets navigation link appears only for signed-in users. The list displays the subject, ticket number, priority, readable status and UTC creation time. Users can open a ticket to read its full description. An empty state directs users to open their first ticket.</w:t>
+      </w:r>
+    </w:p>
+    <w:p>
+      <w:r>
+        <w:t>Every query includes Ticket.user_id == current_user.id. Ticket detail lookup includes both the ticket ID and owner in the same query. Missing tickets and tickets belonging to another account both return HTTP 404. Changing user_id in a query string or guessing an ID does not change access. Account renaming cannot transfer ownership because ownership uses numeric IDs.</w:t>
+      </w:r>
+    </w:p>
+    <w:p>
+      <w:r>
+        <w:t>The list orders by created_at DESC and then id DESC for stable ordering. Pagination is limited to 20 tickets per page. Jinja escapes subjects and descriptions to prevent user-supplied HTML from executing. Multiline descriptions retain their line breaks. Authenticated pages are not stored in shared caches.</w:t>
+      </w:r>
+    </w:p>
+    <w:p>
+      <w:pPr>
+        <w:pStyle w:val="Heading2"/>
+      </w:pPr>
+      <w:r>
+        <w:t>Verification and release checkpoint</w:t>
+      </w:r>
+    </w:p>
+    <w:p>
+      <w:r>
+        <w:t>The feature was committed as cad71e4288717de9fdbc049a31c8d00ace8ce2e1 and merged through PR 10 into main as 742517d. The complete local suite passed 65 tests without skips, including the three existing migration tests against a disposable PostgreSQL instance. The new ticket list and detail tests used isolated SQLite data. No production records were created by these automated tests.</w:t>
+      </w:r>
+    </w:p>
+    <w:p>
+      <w:r>
+        <w:t>Ten new tests cover anonymous and pending accounts, cross-user access, direct ID guessing, username changes, deterministic ordering, pagination, HTML escaping, navigation and empty states. Desktop and 375-pixel mobile views were inspected with synthetic sample tickets. Build 37 finished SUCCESS and the running image was verified as project-y:build-37-742517dae0bc. Its NAS archive passed checksums at /data/share/project-y-builds/Project_Y-f9e324b8/build-37-742517dae0bc. This feature reuses the existing database table and requires no schema change.</w:t>
+      </w:r>
+    </w:p>
+    <w:p>
+      <w:pPr>
+        <w:pStyle w:val="Heading2"/>
+      </w:pPr>
+      <w:r>
+        <w:t>Administration remains a next step</w:t>
+      </w:r>
+    </w:p>
+    <w:p>
+      <w:r>
+        <w:t>My Tickets is a personal view. A site-wide ticket administration screen, administrator role assignment, staff replies and status update actions have not yet been implemented. Any administrator role should attach to a stable user ID, rather than the editable username Daniel.</w:t>
+      </w:r>
+    </w:p>
+    <w:p>
+      <w:pPr>
+        <w:pStyle w:val="Heading1"/>
+        <w:pageBreakBefore/>
+      </w:pPr>
+      <w:r>
+        <w:t>Development Workflow and Password Operations</w:t>
+      </w:r>
+    </w:p>
+    <w:p>
+      <w:pPr>
+        <w:pStyle w:val="Heading2"/>
+      </w:pPr>
+      <w:r>
+        <w:t>Local Python environment and Git</w:t>
+      </w:r>
+    </w:p>
+    <w:p>
+      <w:r>
+        <w:t>The learning checkout is C:/Project_Y-1. Python 3.12 was installed with the Windows Python launcher, then an isolated .venv was created and requirements.txt installed. VS Code was pointed at .venv/Scripts/python.exe so Pylance could resolve Flask-Login and SQLAlchemy imports. The .venv directory is ignored by Git; requirements.txt describes the dependencies.</w:t>
+      </w:r>
+    </w:p>
+    <w:p>
+      <w:pPr>
+        <w:spacing w:after="140"/>
+      </w:pPr>
+      <w:r>
+        <w:rPr>
+          <w:rFonts w:ascii="Consolas" w:hAnsi="Consolas"/>
+          <w:sz w:val="18"/>
+        </w:rPr>
+        <w:t>py install 3.12</w:t>
+        <w:br/>
+        <w:t>py -3.12 -m venv .venv</w:t>
+        <w:br/>
+        <w:t>.\.venv\Scripts\python.exe -m pip install -r requirements.txt</w:t>
+      </w:r>
+    </w:p>
+    <w:p>
+      <w:r>
+        <w:t>Work proceeded on feature/ticket-submission. The template path was checked from the terminal after tests revealed the older disabled form was still saved on disk. CSRF and input-preservation checks were then updated. A pending-account test was corrected to mark the account unverified before the first request, avoiding reuse of a previously loaded user in the shared test context.</w:t>
+      </w:r>
+    </w:p>
+    <w:p>
+      <w:r>
+        <w:t>The developer ran the focused ten-test ticket suite, then the full 55-test suite with three PostgreSQL checks skipped locally. git diff --check and staged-file review passed. Five relevant files were committed as 6fa25f4, pushed to GitHub and merged through PR 9. My Tickets followed in its own feature branch and PR 10.</w:t>
+      </w:r>
+    </w:p>
+    <w:p>
+      <w:pPr>
+        <w:pStyle w:val="Heading2"/>
+      </w:pPr>
+      <w:r>
+        <w:t>Manual password reset procedure</w:t>
+      </w:r>
+    </w:p>
+    <w:p>
+      <w:r>
+        <w:t>A manual reset procedure was provided for the existing GAL account. It locates the username case-insensitively inside the running application, prompts twice using getpass, calls User.set_password and commits the resulting hash. The password is not placed in a shell command, terminal output, Git history or this document. The original password cannot be recovered from its hash.</w:t>
+      </w:r>
+    </w:p>
+    <w:p>
+      <w:r>
+        <w:t>The example initially imposed a 12-character minimum. This was an example-script validation rule, not a storage limit. At the owner request, guidance was revised to reject only an empty password, allowing a six-character password. The reset command was supplied, but successful execution was not reported. No actual password value or completed reset is recorded here.</w:t>
+      </w:r>
+    </w:p>
+    <w:p>
+      <w:r>
+        <w:t>Resetting a password does not verify the email address or revoke existing sessions. A self-service Forgot password flow using an expiring email link is planned but not implemented.</w:t>
+      </w:r>
+    </w:p>
+    <w:p>
+      <w:pPr>
+        <w:pStyle w:val="Heading2"/>
+      </w:pPr>
+      <w:r>
+        <w:t>Remaining operations work</w:t>
+      </w:r>
+    </w:p>
+    <w:p>
+      <w:pPr>
+        <w:pStyle w:val="ListBullet"/>
+      </w:pPr>
+      <w:r>
+        <w:t>Implement ticket administration, replies and authorized status changes.</w:t>
+      </w:r>
+    </w:p>
+    <w:p>
+      <w:pPr>
+        <w:pStyle w:val="ListBullet"/>
+      </w:pPr>
+      <w:r>
+        <w:t>Add a repeatable tickets schema migration for fresh installations.</w:t>
+      </w:r>
+    </w:p>
+    <w:p>
+      <w:pPr>
+        <w:pStyle w:val="ListBullet"/>
+      </w:pPr>
+      <w:r>
+        <w:t>Add self-service password reset and decide how to invalidate old sessions.</w:t>
+      </w:r>
+    </w:p>
+    <w:p>
+      <w:pPr>
+        <w:pStyle w:val="ListBullet"/>
+      </w:pPr>
+      <w:r>
+        <w:t>Run PostgreSQL integration tests in Jenkins and add deployment health checks.</w:t>
+      </w:r>
+    </w:p>
+    <w:p>
+      <w:pPr>
+        <w:pStyle w:val="ListBullet"/>
+      </w:pPr>
+      <w:r>
+        <w:t>Add backup retention, monitoring and periodic full recovery rehearsals.</w:t>
       </w:r>
     </w:p>
     <w:sectPr>
@@ -1776,6 +2090,13 @@
     <w:name w:val="Normal"/>
     <w:qFormat/>
     <w:rsid w:val="00FC693F"/>
+    <w:pPr>
+      <w:spacing w:after="100" w:line="245" w:lineRule="auto"/>
+    </w:pPr>
+    <w:rPr>
+      <w:rFonts w:ascii="Calibri" w:hAnsi="Calibri"/>
+      <w:sz w:val="22"/>
+    </w:rPr>
   </w:style>
   <w:style w:type="paragraph" w:styleId="Header">
     <w:name w:val="header"/>
@@ -1832,14 +2153,14 @@
     <w:pPr>
       <w:keepNext/>
       <w:keepLines/>
-      <w:spacing w:before="480" w:after="0"/>
+      <w:spacing w:before="200" w:after="100"/>
       <w:outlineLvl w:val="0"/>
     </w:pPr>
     <w:rPr>
       <w:rFonts w:asciiTheme="majorHAnsi" w:eastAsiaTheme="majorEastAsia" w:hAnsiTheme="majorHAnsi" w:cstheme="majorBidi"/>
       <w:b/>
       <w:bCs/>
-      <w:color w:val="365F91" w:themeColor="accent1" w:themeShade="BF"/>
+      <w:color w:val="000000"/>
       <w:sz w:val="28"/>
       <w:szCs w:val="28"/>
     </w:rPr>
@@ -1856,14 +2177,14 @@
     <w:pPr>
       <w:keepNext/>
       <w:keepLines/>
-      <w:spacing w:before="200" w:after="0"/>
+      <w:spacing w:before="200" w:after="100"/>
       <w:outlineLvl w:val="1"/>
     </w:pPr>
     <w:rPr>
       <w:rFonts w:asciiTheme="majorHAnsi" w:eastAsiaTheme="majorEastAsia" w:hAnsiTheme="majorHAnsi" w:cstheme="majorBidi"/>
       <w:b/>
       <w:bCs/>
-      <w:color w:val="4F81BD" w:themeColor="accent1"/>
+      <w:color w:val="000000"/>
       <w:sz w:val="28"/>
       <w:szCs w:val="26"/>
     </w:rPr>
@@ -2126,7 +2447,7 @@
     </w:pPr>
     <w:rPr>
       <w:rFonts w:asciiTheme="majorHAnsi" w:eastAsiaTheme="majorEastAsia" w:hAnsiTheme="majorHAnsi" w:cstheme="majorBidi"/>
-      <w:color w:val="17365D" w:themeColor="text2" w:themeShade="BF"/>
+      <w:color w:val="000000"/>
       <w:spacing w:val="5"/>
       <w:kern w:val="28"/>
       <w:sz w:val="52"/>
@@ -2303,8 +2624,13 @@
       <w:numPr>
         <w:numId w:val="1"/>
       </w:numPr>
+      <w:spacing w:after="100" w:line="245" w:lineRule="auto"/>
       <w:contextualSpacing/>
     </w:pPr>
+    <w:rPr>
+      <w:rFonts w:ascii="Calibri" w:hAnsi="Calibri"/>
+      <w:sz w:val="22"/>
+    </w:rPr>
   </w:style>
   <w:style w:type="paragraph" w:styleId="ListBullet2">
     <w:name w:val="List Bullet 2"/>

</xml_diff>